<commit_message>
Rehacer consentimiento informado según el formato del docente (borrador Universidad de Viena)
Co-Authored-By: Claude Opus 5.5 <noreply@anthropic.com>
Claude-Session: https://claude.ai/code/session_01J1s9CqbZp6VUjcGGtWD9F3
</commit_message>
<xml_diff>
--- a/Trabajo_Final_Investigacion_II.docx
+++ b/Trabajo_Final_Investigacion_II.docx
@@ -9000,6 +9000,25 @@
         <w:t xml:space="preserve">4.2. Consentimiento informado</w:t>
       </w:r>
     </w:p>
+    <w:p>
+      <w:pPr>
+        <w:spacing w:after="120" w:line="300"/>
+        <w:jc w:val="both"/>
+      </w:pPr>
+      <w:r>
+        <w:t xml:space="preserve">El consentimiento se elaboró con el </w:t>
+      </w:r>
+      <w:r>
+        <w:rPr>
+          <w:b/>
+          <w:bCs/>
+        </w:rPr>
+        <w:t xml:space="preserve">formato proporcionado por el docente en la plataforma</w:t>
+      </w:r>
+      <w:r>
+        <w:t xml:space="preserve"> (borrador de consentimiento informado de la Universidad de Viena), siguiendo sus instrucciones:</w:t>
+      </w:r>
+    </w:p>
     <w:tbl>
       <w:tblPr>
         <w:tblW w:type="dxa" w:w="9360"/>
@@ -9013,68 +9032,368 @@
         </w:tblBorders>
       </w:tblPr>
       <w:tblGrid>
-        <w:gridCol w:w="9360"/>
+        <w:gridCol w:w="4200"/>
+        <w:gridCol w:w="5160"/>
       </w:tblGrid>
       <w:tr>
-        <w:tc>
-          <w:tcPr>
-            <w:tcW w:type="dxa" w:w="9360"/>
-            <w:tcBorders>
-              <w:top w:val="single" w:color="8EA9C1" w:sz="4"/>
-              <w:left w:val="single" w:color="8EA9C1" w:sz="4"/>
-              <w:bottom w:val="single" w:color="8EA9C1" w:sz="4"/>
-              <w:right w:val="single" w:color="8EA9C1" w:sz="4"/>
-            </w:tcBorders>
-            <w:shd w:fill="FFF2CC" w:color="auto" w:val="clear"/>
-            <w:tcMar>
-              <w:top w:type="dxa" w:w="140"/>
-              <w:left w:type="dxa" w:w="200"/>
-              <w:bottom w:type="dxa" w:w="140"/>
-              <w:right w:type="dxa" w:w="200"/>
-            </w:tcMar>
-          </w:tcPr>
-          <w:p>
-            <w:pPr>
-              <w:spacing w:after="80" w:line="290"/>
-            </w:pPr>
-            <w:r>
-              <w:rPr>
-                <w:sz w:val="22"/>
-                <w:szCs w:val="22"/>
-              </w:rPr>
-              <w:t xml:space="preserve"/>
-            </w:r>
+        <w:trPr>
+          <w:tblHeader/>
+        </w:trPr>
+        <w:tc>
+          <w:tcPr>
+            <w:tcW w:type="dxa" w:w="4200"/>
+            <w:tcBorders>
+              <w:top w:val="single" w:color="8EA9C1" w:sz="4"/>
+              <w:left w:val="single" w:color="8EA9C1" w:sz="4"/>
+              <w:bottom w:val="single" w:color="8EA9C1" w:sz="4"/>
+              <w:right w:val="single" w:color="8EA9C1" w:sz="4"/>
+            </w:tcBorders>
+            <w:shd w:fill="1F3864" w:color="auto" w:val="clear"/>
+            <w:tcMar>
+              <w:top w:type="dxa" w:w="80"/>
+              <w:left w:type="dxa" w:w="110"/>
+              <w:bottom w:type="dxa" w:w="80"/>
+              <w:right w:type="dxa" w:w="110"/>
+            </w:tcMar>
+          </w:tcPr>
+          <w:p>
+            <w:pPr>
+              <w:spacing w:after="40"/>
+            </w:pPr>
             <w:r>
               <w:rPr>
                 <w:b/>
                 <w:bCs/>
-                <w:sz w:val="22"/>
-                <w:szCs w:val="22"/>
-              </w:rPr>
-              <w:t xml:space="preserve">Importante:</w:t>
-            </w:r>
-            <w:r>
-              <w:rPr>
-                <w:sz w:val="22"/>
-                <w:szCs w:val="22"/>
-              </w:rPr>
-              <w:t xml:space="preserve"> el docente indicó que el consentimiento debe seguir el </w:t>
-            </w:r>
+                <w:color w:val="FFFFFF"/>
+                <w:sz w:val="20"/>
+                <w:szCs w:val="20"/>
+              </w:rPr>
+              <w:t xml:space="preserve">Indicación del formato</w:t>
+            </w:r>
+          </w:p>
+        </w:tc>
+        <w:tc>
+          <w:tcPr>
+            <w:tcW w:type="dxa" w:w="5160"/>
+            <w:tcBorders>
+              <w:top w:val="single" w:color="8EA9C1" w:sz="4"/>
+              <w:left w:val="single" w:color="8EA9C1" w:sz="4"/>
+              <w:bottom w:val="single" w:color="8EA9C1" w:sz="4"/>
+              <w:right w:val="single" w:color="8EA9C1" w:sz="4"/>
+            </w:tcBorders>
+            <w:shd w:fill="1F3864" w:color="auto" w:val="clear"/>
+            <w:tcMar>
+              <w:top w:type="dxa" w:w="80"/>
+              <w:left w:type="dxa" w:w="110"/>
+              <w:bottom w:type="dxa" w:w="80"/>
+              <w:right w:type="dxa" w:w="110"/>
+            </w:tcMar>
+          </w:tcPr>
+          <w:p>
+            <w:pPr>
+              <w:spacing w:after="40"/>
+            </w:pPr>
             <w:r>
               <w:rPr>
                 <w:b/>
                 <w:bCs/>
-                <w:sz w:val="22"/>
-                <w:szCs w:val="22"/>
-              </w:rPr>
-              <w:t xml:space="preserve">formato subido a la plataforma (Unidad 1 o 2)</w:t>
-            </w:r>
-            <w:r>
-              <w:rPr>
-                <w:sz w:val="22"/>
-                <w:szCs w:val="22"/>
-              </w:rPr>
-              <w:t xml:space="preserve">. Este modelo contiene todos los elementos básicos; antes del examen, compárenlo con ese formato y ajusten el orden o los títulos para que coincidan.</w:t>
+                <w:color w:val="FFFFFF"/>
+                <w:sz w:val="20"/>
+                <w:szCs w:val="20"/>
+              </w:rPr>
+              <w:t xml:space="preserve">Qué hicimos</w:t>
+            </w:r>
+          </w:p>
+        </w:tc>
+      </w:tr>
+      <w:tr>
+        <w:tc>
+          <w:tcPr>
+            <w:tcW w:type="dxa" w:w="4200"/>
+            <w:tcBorders>
+              <w:top w:val="single" w:color="8EA9C1" w:sz="4"/>
+              <w:left w:val="single" w:color="8EA9C1" w:sz="4"/>
+              <w:bottom w:val="single" w:color="8EA9C1" w:sz="4"/>
+              <w:right w:val="single" w:color="8EA9C1" w:sz="4"/>
+            </w:tcBorders>
+            <w:tcMar>
+              <w:top w:type="dxa" w:w="80"/>
+              <w:left w:type="dxa" w:w="110"/>
+              <w:bottom w:type="dxa" w:w="80"/>
+              <w:right w:type="dxa" w:w="110"/>
+            </w:tcMar>
+          </w:tcPr>
+          <w:p>
+            <w:pPr>
+              <w:spacing w:after="40"/>
+            </w:pPr>
+            <w:r>
+              <w:rPr>
+                <w:sz w:val="20"/>
+                <w:szCs w:val="20"/>
+              </w:rPr>
+              <w:t xml:space="preserve">Partes en </w:t>
+            </w:r>
+            <w:r>
+              <w:rPr>
+                <w:b/>
+                <w:bCs/>
+                <w:sz w:val="20"/>
+                <w:szCs w:val="20"/>
+              </w:rPr>
+              <w:t xml:space="preserve">amarillo</w:t>
+            </w:r>
+            <w:r>
+              <w:rPr>
+                <w:sz w:val="20"/>
+                <w:szCs w:val="20"/>
+              </w:rPr>
+              <w:t xml:space="preserve">: las completa el investigador.</w:t>
+            </w:r>
+          </w:p>
+        </w:tc>
+        <w:tc>
+          <w:tcPr>
+            <w:tcW w:type="dxa" w:w="5160"/>
+            <w:tcBorders>
+              <w:top w:val="single" w:color="8EA9C1" w:sz="4"/>
+              <w:left w:val="single" w:color="8EA9C1" w:sz="4"/>
+              <w:bottom w:val="single" w:color="8EA9C1" w:sz="4"/>
+              <w:right w:val="single" w:color="8EA9C1" w:sz="4"/>
+            </w:tcBorders>
+            <w:tcMar>
+              <w:top w:type="dxa" w:w="80"/>
+              <w:left w:type="dxa" w:w="110"/>
+              <w:bottom w:type="dxa" w:w="80"/>
+              <w:right w:type="dxa" w:w="110"/>
+            </w:tcMar>
+          </w:tcPr>
+          <w:p>
+            <w:pPr>
+              <w:spacing w:after="40"/>
+            </w:pPr>
+            <w:r>
+              <w:rPr>
+                <w:sz w:val="20"/>
+                <w:szCs w:val="20"/>
+              </w:rPr>
+              <w:t xml:space="preserve">Se completaron con la información de nuestro estudio.</w:t>
+            </w:r>
+          </w:p>
+        </w:tc>
+      </w:tr>
+      <w:tr>
+        <w:tc>
+          <w:tcPr>
+            <w:tcW w:type="dxa" w:w="4200"/>
+            <w:tcBorders>
+              <w:top w:val="single" w:color="8EA9C1" w:sz="4"/>
+              <w:left w:val="single" w:color="8EA9C1" w:sz="4"/>
+              <w:bottom w:val="single" w:color="8EA9C1" w:sz="4"/>
+              <w:right w:val="single" w:color="8EA9C1" w:sz="4"/>
+            </w:tcBorders>
+            <w:shd w:fill="F2F2F2" w:color="auto" w:val="clear"/>
+            <w:tcMar>
+              <w:top w:type="dxa" w:w="80"/>
+              <w:left w:type="dxa" w:w="110"/>
+              <w:bottom w:type="dxa" w:w="80"/>
+              <w:right w:type="dxa" w:w="110"/>
+            </w:tcMar>
+          </w:tcPr>
+          <w:p>
+            <w:pPr>
+              <w:spacing w:after="40"/>
+            </w:pPr>
+            <w:r>
+              <w:rPr>
+                <w:sz w:val="20"/>
+                <w:szCs w:val="20"/>
+              </w:rPr>
+              <w:t xml:space="preserve">Partes en </w:t>
+            </w:r>
+            <w:r>
+              <w:rPr>
+                <w:b/>
+                <w:bCs/>
+                <w:sz w:val="20"/>
+                <w:szCs w:val="20"/>
+              </w:rPr>
+              <w:t xml:space="preserve">azul</w:t>
+            </w:r>
+            <w:r>
+              <w:rPr>
+                <w:sz w:val="20"/>
+                <w:szCs w:val="20"/>
+              </w:rPr>
+              <w:t xml:space="preserve">: son explicaciones para quien redacta y se borran.</w:t>
+            </w:r>
+          </w:p>
+        </w:tc>
+        <w:tc>
+          <w:tcPr>
+            <w:tcW w:type="dxa" w:w="5160"/>
+            <w:tcBorders>
+              <w:top w:val="single" w:color="8EA9C1" w:sz="4"/>
+              <w:left w:val="single" w:color="8EA9C1" w:sz="4"/>
+              <w:bottom w:val="single" w:color="8EA9C1" w:sz="4"/>
+              <w:right w:val="single" w:color="8EA9C1" w:sz="4"/>
+            </w:tcBorders>
+            <w:shd w:fill="F2F2F2" w:color="auto" w:val="clear"/>
+            <w:tcMar>
+              <w:top w:type="dxa" w:w="80"/>
+              <w:left w:type="dxa" w:w="110"/>
+              <w:bottom w:type="dxa" w:w="80"/>
+              <w:right w:type="dxa" w:w="110"/>
+            </w:tcMar>
+          </w:tcPr>
+          <w:p>
+            <w:pPr>
+              <w:spacing w:after="40"/>
+            </w:pPr>
+            <w:r>
+              <w:rPr>
+                <w:sz w:val="20"/>
+                <w:szCs w:val="20"/>
+              </w:rPr>
+              <w:t xml:space="preserve">Se eliminaron de la versión para los participantes.</w:t>
+            </w:r>
+          </w:p>
+        </w:tc>
+      </w:tr>
+      <w:tr>
+        <w:tc>
+          <w:tcPr>
+            <w:tcW w:type="dxa" w:w="4200"/>
+            <w:tcBorders>
+              <w:top w:val="single" w:color="8EA9C1" w:sz="4"/>
+              <w:left w:val="single" w:color="8EA9C1" w:sz="4"/>
+              <w:bottom w:val="single" w:color="8EA9C1" w:sz="4"/>
+              <w:right w:val="single" w:color="8EA9C1" w:sz="4"/>
+            </w:tcBorders>
+            <w:tcMar>
+              <w:top w:type="dxa" w:w="80"/>
+              <w:left w:type="dxa" w:w="110"/>
+              <w:bottom w:type="dxa" w:w="80"/>
+              <w:right w:type="dxa" w:w="110"/>
+            </w:tcMar>
+          </w:tcPr>
+          <w:p>
+            <w:pPr>
+              <w:spacing w:after="40"/>
+            </w:pPr>
+            <w:r>
+              <w:rPr>
+                <w:sz w:val="20"/>
+                <w:szCs w:val="20"/>
+              </w:rPr>
+              <w:t xml:space="preserve">Partes en </w:t>
+            </w:r>
+            <w:r>
+              <w:rPr>
+                <w:b/>
+                <w:bCs/>
+                <w:sz w:val="20"/>
+                <w:szCs w:val="20"/>
+              </w:rPr>
+              <w:t xml:space="preserve">verde</w:t>
+            </w:r>
+            <w:r>
+              <w:rPr>
+                <w:sz w:val="20"/>
+                <w:szCs w:val="20"/>
+              </w:rPr>
+              <w:t xml:space="preserve">: solo aplican a estudios experimentales en salud.</w:t>
+            </w:r>
+          </w:p>
+        </w:tc>
+        <w:tc>
+          <w:tcPr>
+            <w:tcW w:type="dxa" w:w="5160"/>
+            <w:tcBorders>
+              <w:top w:val="single" w:color="8EA9C1" w:sz="4"/>
+              <w:left w:val="single" w:color="8EA9C1" w:sz="4"/>
+              <w:bottom w:val="single" w:color="8EA9C1" w:sz="4"/>
+              <w:right w:val="single" w:color="8EA9C1" w:sz="4"/>
+            </w:tcBorders>
+            <w:tcMar>
+              <w:top w:type="dxa" w:w="80"/>
+              <w:left w:type="dxa" w:w="110"/>
+              <w:bottom w:type="dxa" w:w="80"/>
+              <w:right w:type="dxa" w:w="110"/>
+            </w:tcMar>
+          </w:tcPr>
+          <w:p>
+            <w:pPr>
+              <w:spacing w:after="40"/>
+            </w:pPr>
+            <w:r>
+              <w:rPr>
+                <w:sz w:val="20"/>
+                <w:szCs w:val="20"/>
+              </w:rPr>
+              <w:t xml:space="preserve">Se eliminaron los puntos 5 (efectos en el estilo de vida) y 6 (malestar o lesiones), porque nuestro estudio es una encuesta no experimental.</w:t>
+            </w:r>
+          </w:p>
+        </w:tc>
+      </w:tr>
+      <w:tr>
+        <w:tc>
+          <w:tcPr>
+            <w:tcW w:type="dxa" w:w="4200"/>
+            <w:tcBorders>
+              <w:top w:val="single" w:color="8EA9C1" w:sz="4"/>
+              <w:left w:val="single" w:color="8EA9C1" w:sz="4"/>
+              <w:bottom w:val="single" w:color="8EA9C1" w:sz="4"/>
+              <w:right w:val="single" w:color="8EA9C1" w:sz="4"/>
+            </w:tcBorders>
+            <w:shd w:fill="F2F2F2" w:color="auto" w:val="clear"/>
+            <w:tcMar>
+              <w:top w:type="dxa" w:w="80"/>
+              <w:left w:type="dxa" w:w="110"/>
+              <w:bottom w:type="dxa" w:w="80"/>
+              <w:right w:type="dxa" w:w="110"/>
+            </w:tcMar>
+          </w:tcPr>
+          <w:p>
+            <w:pPr>
+              <w:spacing w:after="40"/>
+            </w:pPr>
+            <w:r>
+              <w:rPr>
+                <w:sz w:val="20"/>
+                <w:szCs w:val="20"/>
+              </w:rPr>
+              <w:t xml:space="preserve">Punto 7: solo aplica a estudios longitudinales.</w:t>
+            </w:r>
+          </w:p>
+        </w:tc>
+        <w:tc>
+          <w:tcPr>
+            <w:tcW w:type="dxa" w:w="5160"/>
+            <w:tcBorders>
+              <w:top w:val="single" w:color="8EA9C1" w:sz="4"/>
+              <w:left w:val="single" w:color="8EA9C1" w:sz="4"/>
+              <w:bottom w:val="single" w:color="8EA9C1" w:sz="4"/>
+              <w:right w:val="single" w:color="8EA9C1" w:sz="4"/>
+            </w:tcBorders>
+            <w:shd w:fill="F2F2F2" w:color="auto" w:val="clear"/>
+            <w:tcMar>
+              <w:top w:type="dxa" w:w="80"/>
+              <w:left w:type="dxa" w:w="110"/>
+              <w:bottom w:type="dxa" w:w="80"/>
+              <w:right w:type="dxa" w:w="110"/>
+            </w:tcMar>
+          </w:tcPr>
+          <w:p>
+            <w:pPr>
+              <w:spacing w:after="40"/>
+            </w:pPr>
+            <w:r>
+              <w:rPr>
+                <w:sz w:val="20"/>
+                <w:szCs w:val="20"/>
+              </w:rPr>
+              <w:t xml:space="preserve">Se eliminó, porque nuestro estudio es transversal (una sola medición).</w:t>
             </w:r>
           </w:p>
         </w:tc>
@@ -9088,13 +9407,31 @@
     <w:p>
       <w:pPr>
         <w:spacing w:after="120" w:line="300"/>
+        <w:jc w:val="both"/>
+      </w:pPr>
+      <w:r>
+        <w:rPr>
+          <w:i/>
+          <w:iCs/>
+        </w:rPr>
+        <w:t xml:space="preserve">Por eso los puntos de la versión final quedan numerados del 1 al 7. A continuación se presenta la versión que se entrega a los participantes.</w:t>
+      </w:r>
+    </w:p>
+    <w:p>
+      <w:r>
+        <w:br w:type="page"/>
+      </w:r>
+    </w:p>
+    <w:p>
+      <w:pPr>
+        <w:spacing w:after="120" w:line="300"/>
         <w:jc w:val="center"/>
       </w:pPr>
       <w:r>
         <w:rPr>
           <w:color w:val="1F3864"/>
-          <w:sz w:val="24"/>
-          <w:szCs w:val="24"/>
+          <w:sz w:val="22"/>
+          <w:szCs w:val="22"/>
         </w:rPr>
         <w:t xml:space="preserve"/>
       </w:r>
@@ -9103,17 +9440,55 @@
           <w:b/>
           <w:bCs/>
           <w:color w:val="1F3864"/>
-          <w:sz w:val="24"/>
-          <w:szCs w:val="24"/>
-        </w:rPr>
-        <w:t xml:space="preserve">UNIVERSIDAD NUR – CARRERA DE MARKETING</w:t>
+          <w:sz w:val="22"/>
+          <w:szCs w:val="22"/>
+        </w:rPr>
+        <w:t xml:space="preserve">UNIVERSIDAD NUR – CARRERA DE MARKETING – INVESTIGACIÓN II</w:t>
       </w:r>
       <w:r>
         <w:rPr>
           <w:color w:val="1F3864"/>
-          <w:sz w:val="24"/>
-          <w:szCs w:val="24"/>
-        </w:rPr>
+          <w:sz w:val="22"/>
+          <w:szCs w:val="22"/>
+        </w:rPr>
+        <w:t xml:space="preserve"/>
+      </w:r>
+    </w:p>
+    <w:p>
+      <w:pPr>
+        <w:spacing w:after="120" w:line="300"/>
+        <w:jc w:val="right"/>
+      </w:pPr>
+      <w:r>
+        <w:t xml:space="preserve"/>
+      </w:r>
+      <w:r>
+        <w:rPr>
+          <w:b/>
+          <w:bCs/>
+        </w:rPr>
+        <w:t xml:space="preserve">Fecha:</w:t>
+      </w:r>
+      <w:r>
+        <w:t xml:space="preserve"> ____ / ____ / 2026</w:t>
+      </w:r>
+    </w:p>
+    <w:p>
+      <w:pPr>
+        <w:spacing w:after="120" w:line="300"/>
+        <w:jc w:val="both"/>
+      </w:pPr>
+      <w:r>
+        <w:t xml:space="preserve"/>
+      </w:r>
+      <w:r>
+        <w:rPr>
+          <w:b/>
+          <w:bCs/>
+        </w:rPr>
+        <w:t xml:space="preserve">Información para los participantes y declaración de consentimiento para participar en el estudio:</w:t>
+      </w:r>
+      <w:r>
         <w:t xml:space="preserve"/>
       </w:r>
     </w:p>
@@ -9121,6 +9496,129 @@
       <w:pPr>
         <w:spacing w:after="120" w:line="300"/>
         <w:jc w:val="center"/>
+      </w:pPr>
+      <w:r>
+        <w:rPr>
+          <w:i/>
+          <w:iCs/>
+        </w:rPr>
+        <w:t xml:space="preserve"/>
+      </w:r>
+      <w:r>
+        <w:rPr>
+          <w:b/>
+          <w:bCs/>
+          <w:i/>
+          <w:iCs/>
+        </w:rPr>
+        <w:t xml:space="preserve">Prevalencia del uso de cigarrillos electrónicos y su relación con la percepción de riesgo y los síntomas respiratorios en estudiantes de la Universidad NUR, 2026</w:t>
+      </w:r>
+      <w:r>
+        <w:rPr>
+          <w:i/>
+          <w:iCs/>
+        </w:rPr>
+        <w:t xml:space="preserve"/>
+      </w:r>
+    </w:p>
+    <w:p>
+      <w:pPr>
+        <w:spacing w:after="120" w:line="300"/>
+        <w:jc w:val="both"/>
+      </w:pPr>
+      <w:r>
+        <w:t xml:space="preserve">Estimado/a participante:</w:t>
+      </w:r>
+    </w:p>
+    <w:p>
+      <w:pPr>
+        <w:spacing w:after="120" w:line="300"/>
+        <w:jc w:val="both"/>
+      </w:pPr>
+      <w:r>
+        <w:t xml:space="preserve">Nos gustaría invitarlo/a a participar en el estudio mencionado anteriormente. Antes de responder, uno de los investigadores le dará una breve explicación en el aula.</w:t>
+      </w:r>
+    </w:p>
+    <w:p>
+      <w:pPr>
+        <w:spacing w:after="120" w:line="300"/>
+        <w:jc w:val="both"/>
+      </w:pPr>
+      <w:r>
+        <w:t xml:space="preserve"/>
+      </w:r>
+      <w:r>
+        <w:rPr>
+          <w:b/>
+          <w:bCs/>
+        </w:rPr>
+        <w:t xml:space="preserve">Su participación en este estudio es voluntaria. Puede negarse a participar en cualquier momento, sin necesidad de dar una razón, o también retirar su consentimiento para participar una vez que el estudio ya haya comenzado. No habrá consecuencias negativas para usted si se niega a participar o si se retira de este estudio antes de tiempo.</w:t>
+      </w:r>
+      <w:r>
+        <w:t xml:space="preserve"/>
+      </w:r>
+    </w:p>
+    <w:p>
+      <w:pPr>
+        <w:spacing w:after="120" w:line="300"/>
+        <w:jc w:val="both"/>
+      </w:pPr>
+      <w:r>
+        <w:t xml:space="preserve">Este tipo de estudio es necesario para obtener resultados de investigación académicos nuevos y confiables. Sin embargo, su consentimiento para participar en el estudio es un requisito indispensable para que podamos llevarlo a cabo. Por favor, tómese el tiempo necesario para leer atentamente la siguiente información, además de la breve explicación en el aula, y no dude en hacer preguntas.</w:t>
+      </w:r>
+    </w:p>
+    <w:p>
+      <w:pPr>
+        <w:spacing w:after="120" w:line="300"/>
+        <w:jc w:val="both"/>
+      </w:pPr>
+      <w:r>
+        <w:t xml:space="preserve">Por favor, firme la declaración de consentimiento únicamente:</w:t>
+      </w:r>
+    </w:p>
+    <w:p>
+      <w:pPr>
+        <w:pStyle w:val="ListParagraph"/>
+        <w:numPr>
+          <w:ilvl w:val="0"/>
+          <w:numId w:val="2"/>
+        </w:numPr>
+        <w:spacing w:after="60" w:line="280"/>
+      </w:pPr>
+      <w:r>
+        <w:t xml:space="preserve">si ha comprendido plenamente el tipo y el procedimiento del estudio,</w:t>
+      </w:r>
+    </w:p>
+    <w:p>
+      <w:pPr>
+        <w:pStyle w:val="ListParagraph"/>
+        <w:numPr>
+          <w:ilvl w:val="0"/>
+          <w:numId w:val="2"/>
+        </w:numPr>
+        <w:spacing w:after="60" w:line="280"/>
+      </w:pPr>
+      <w:r>
+        <w:t xml:space="preserve">si está dispuesto/a a dar su consentimiento para participar, y</w:t>
+      </w:r>
+    </w:p>
+    <w:p>
+      <w:pPr>
+        <w:pStyle w:val="ListParagraph"/>
+        <w:numPr>
+          <w:ilvl w:val="0"/>
+          <w:numId w:val="2"/>
+        </w:numPr>
+        <w:spacing w:after="60" w:line="280"/>
+      </w:pPr>
+      <w:r>
+        <w:t xml:space="preserve">si conoce sus derechos como participante en este estudio.</w:t>
+      </w:r>
+    </w:p>
+    <w:p>
+      <w:pPr>
+        <w:keepNext/>
+        <w:spacing w:after="80" w:before="160"/>
       </w:pPr>
       <w:r>
         <w:rPr>
@@ -9136,13 +9634,650 @@
           <w:sz w:val="22"/>
           <w:szCs w:val="22"/>
         </w:rPr>
-        <w:t xml:space="preserve">CONSENTIMIENTO INFORMADO PARA PARTICIPAR EN UNA INVESTIGACIÓN</w:t>
+        <w:t xml:space="preserve">1. ¿Cuál es el propósito de este estudio?</w:t>
       </w:r>
       <w:r>
         <w:rPr>
           <w:sz w:val="22"/>
           <w:szCs w:val="22"/>
         </w:rPr>
+        <w:t xml:space="preserve"/>
+      </w:r>
+    </w:p>
+    <w:p>
+      <w:pPr>
+        <w:spacing w:after="120" w:line="300"/>
+        <w:jc w:val="both"/>
+      </w:pPr>
+      <w:r>
+        <w:t xml:space="preserve">Este estudio busca conocer </w:t>
+      </w:r>
+      <w:r>
+        <w:rPr>
+          <w:b/>
+          <w:bCs/>
+        </w:rPr>
+        <w:t xml:space="preserve">cuántos estudiantes de la Universidad NUR usan cigarrillos electrónicos</w:t>
+      </w:r>
+      <w:r>
+        <w:t xml:space="preserve"> (vapeadores, pods o «puffs»), </w:t>
+      </w:r>
+      <w:r>
+        <w:rPr>
+          <w:b/>
+          <w:bCs/>
+        </w:rPr>
+        <w:t xml:space="preserve">qué opinan sobre sus riesgos</w:t>
+      </w:r>
+      <w:r>
+        <w:t xml:space="preserve"> para la salud y </w:t>
+      </w:r>
+      <w:r>
+        <w:rPr>
+          <w:b/>
+          <w:bCs/>
+        </w:rPr>
+        <w:t xml:space="preserve">si presentan síntomas respiratorios</w:t>
+      </w:r>
+      <w:r>
+        <w:t xml:space="preserve"> como tos, flema o falta de aire. También queremos saber si existe una relación entre el uso del vapeador, la percepción de riesgo y estos síntomas.</w:t>
+      </w:r>
+    </w:p>
+    <w:p>
+      <w:pPr>
+        <w:keepNext/>
+        <w:spacing w:after="80" w:before="160"/>
+      </w:pPr>
+      <w:r>
+        <w:rPr>
+          <w:sz w:val="22"/>
+          <w:szCs w:val="22"/>
+        </w:rPr>
+        <w:t xml:space="preserve"/>
+      </w:r>
+      <w:r>
+        <w:rPr>
+          <w:b/>
+          <w:bCs/>
+          <w:sz w:val="22"/>
+          <w:szCs w:val="22"/>
+        </w:rPr>
+        <w:t xml:space="preserve">2. ¿Cuál es el procedimiento del estudio?</w:t>
+      </w:r>
+      <w:r>
+        <w:rPr>
+          <w:sz w:val="22"/>
+          <w:szCs w:val="22"/>
+        </w:rPr>
+        <w:t xml:space="preserve"/>
+      </w:r>
+    </w:p>
+    <w:p>
+      <w:pPr>
+        <w:pStyle w:val="ListParagraph"/>
+        <w:numPr>
+          <w:ilvl w:val="0"/>
+          <w:numId w:val="2"/>
+        </w:numPr>
+        <w:spacing w:after="60" w:line="280"/>
+      </w:pPr>
+      <w:r>
+        <w:t xml:space="preserve"/>
+      </w:r>
+      <w:r>
+        <w:rPr>
+          <w:b/>
+          <w:bCs/>
+        </w:rPr>
+        <w:t xml:space="preserve">¿Quiénes pueden participar?</w:t>
+      </w:r>
+      <w:r>
+        <w:t xml:space="preserve"> Estudiantes regulares de pregrado de la Universidad NUR, matriculados en el segundo semestre de 2026 y con 18 años o más.</w:t>
+      </w:r>
+    </w:p>
+    <w:p>
+      <w:pPr>
+        <w:pStyle w:val="ListParagraph"/>
+        <w:numPr>
+          <w:ilvl w:val="0"/>
+          <w:numId w:val="2"/>
+        </w:numPr>
+        <w:spacing w:after="60" w:line="280"/>
+      </w:pPr>
+      <w:r>
+        <w:t xml:space="preserve"/>
+      </w:r>
+      <w:r>
+        <w:rPr>
+          <w:b/>
+          <w:bCs/>
+        </w:rPr>
+        <w:t xml:space="preserve">¿Cuántos participarán?</w:t>
+      </w:r>
+      <w:r>
+        <w:t xml:space="preserve"> Aproximadamente 350 estudiantes de distintas facultades. Su curso fue elegido </w:t>
+      </w:r>
+      <w:r>
+        <w:rPr>
+          <w:b/>
+          <w:bCs/>
+        </w:rPr>
+        <w:t xml:space="preserve">por sorteo</w:t>
+      </w:r>
+      <w:r>
+        <w:t xml:space="preserve">.</w:t>
+      </w:r>
+    </w:p>
+    <w:p>
+      <w:pPr>
+        <w:pStyle w:val="ListParagraph"/>
+        <w:numPr>
+          <w:ilvl w:val="0"/>
+          <w:numId w:val="2"/>
+        </w:numPr>
+        <w:spacing w:after="60" w:line="280"/>
+      </w:pPr>
+      <w:r>
+        <w:t xml:space="preserve"/>
+      </w:r>
+      <w:r>
+        <w:rPr>
+          <w:b/>
+          <w:bCs/>
+        </w:rPr>
+        <w:t xml:space="preserve">¿Qué tendrá que hacer?</w:t>
+      </w:r>
+      <w:r>
+        <w:t xml:space="preserve"> Responder </w:t>
+      </w:r>
+      <w:r>
+        <w:rPr>
+          <w:b/>
+          <w:bCs/>
+        </w:rPr>
+        <w:t xml:space="preserve">una sola vez</w:t>
+      </w:r>
+      <w:r>
+        <w:t xml:space="preserve"> un cuestionario anónimo de 33 preguntas cerradas (marcar opciones), desde su celular mediante un código QR (Google Forms) o en papel.</w:t>
+      </w:r>
+    </w:p>
+    <w:p>
+      <w:pPr>
+        <w:pStyle w:val="ListParagraph"/>
+        <w:numPr>
+          <w:ilvl w:val="0"/>
+          <w:numId w:val="2"/>
+        </w:numPr>
+        <w:spacing w:after="60" w:line="280"/>
+      </w:pPr>
+      <w:r>
+        <w:t xml:space="preserve"/>
+      </w:r>
+      <w:r>
+        <w:rPr>
+          <w:b/>
+          <w:bCs/>
+        </w:rPr>
+        <w:t xml:space="preserve">¿Cuánto tiempo toma?</w:t>
+      </w:r>
+      <w:r>
+        <w:t xml:space="preserve"> Entre 10 y 12 minutos.</w:t>
+      </w:r>
+    </w:p>
+    <w:p>
+      <w:pPr>
+        <w:pStyle w:val="ListParagraph"/>
+        <w:numPr>
+          <w:ilvl w:val="0"/>
+          <w:numId w:val="2"/>
+        </w:numPr>
+        <w:spacing w:after="60" w:line="280"/>
+      </w:pPr>
+      <w:r>
+        <w:t xml:space="preserve"/>
+      </w:r>
+      <w:r>
+        <w:rPr>
+          <w:b/>
+          <w:bCs/>
+        </w:rPr>
+        <w:t xml:space="preserve">¿Dónde y cuándo?</w:t>
+      </w:r>
+      <w:r>
+        <w:t xml:space="preserve"> En su aula, en la Universidad NUR (Santa Cruz de la Sierra), durante el horario de clase y con autorización del docente, entre el 9 y el 22 de noviembre de 2026.</w:t>
+      </w:r>
+    </w:p>
+    <w:p>
+      <w:pPr>
+        <w:pStyle w:val="ListParagraph"/>
+        <w:numPr>
+          <w:ilvl w:val="0"/>
+          <w:numId w:val="2"/>
+        </w:numPr>
+        <w:spacing w:after="60" w:line="280"/>
+      </w:pPr>
+      <w:r>
+        <w:t xml:space="preserve"/>
+      </w:r>
+      <w:r>
+        <w:rPr>
+          <w:b/>
+          <w:bCs/>
+        </w:rPr>
+        <w:t xml:space="preserve">Marco institucional:</w:t>
+      </w:r>
+      <w:r>
+        <w:t xml:space="preserve"> es un trabajo académico de la asignatura Investigación II de la Carrera de Marketing de la Universidad NUR, supervisado por el docente de la asignatura.</w:t>
+      </w:r>
+    </w:p>
+    <w:p>
+      <w:pPr>
+        <w:keepNext/>
+        <w:spacing w:after="80" w:before="160"/>
+      </w:pPr>
+      <w:r>
+        <w:rPr>
+          <w:sz w:val="22"/>
+          <w:szCs w:val="22"/>
+        </w:rPr>
+        <w:t xml:space="preserve"/>
+      </w:r>
+      <w:r>
+        <w:rPr>
+          <w:b/>
+          <w:bCs/>
+          <w:sz w:val="22"/>
+          <w:szCs w:val="22"/>
+        </w:rPr>
+        <w:t xml:space="preserve">3. ¿Cuáles son los beneficios de participar en el estudio?</w:t>
+      </w:r>
+      <w:r>
+        <w:rPr>
+          <w:sz w:val="22"/>
+          <w:szCs w:val="22"/>
+        </w:rPr>
+        <w:t xml:space="preserve"/>
+      </w:r>
+    </w:p>
+    <w:p>
+      <w:pPr>
+        <w:spacing w:after="120" w:line="300"/>
+        <w:jc w:val="both"/>
+      </w:pPr>
+      <w:r>
+        <w:t xml:space="preserve">Es poco probable que usted obtenga un beneficio personal directo (por ejemplo, relacionado con la salud) por participar en este estudio.</w:t>
+      </w:r>
+    </w:p>
+    <w:p>
+      <w:pPr>
+        <w:spacing w:after="120" w:line="300"/>
+        <w:jc w:val="both"/>
+      </w:pPr>
+      <w:r>
+        <w:t xml:space="preserve">Se espera que los resultados de este estudio brinden información importante sobre el consumo de cigarrillos electrónicos entre los estudiantes universitarios de Santa Cruz. Esta información podrá servir para diseñar campañas de prevención y actividades de bienestar estudiantil dentro de la universidad.</w:t>
+      </w:r>
+    </w:p>
+    <w:p>
+      <w:pPr>
+        <w:keepNext/>
+        <w:spacing w:after="80" w:before="160"/>
+      </w:pPr>
+      <w:r>
+        <w:rPr>
+          <w:sz w:val="22"/>
+          <w:szCs w:val="22"/>
+        </w:rPr>
+        <w:t xml:space="preserve"/>
+      </w:r>
+      <w:r>
+        <w:rPr>
+          <w:b/>
+          <w:bCs/>
+          <w:sz w:val="22"/>
+          <w:szCs w:val="22"/>
+        </w:rPr>
+        <w:t xml:space="preserve">4. ¿Cuáles son los posibles riesgos de participar en este estudio? ¿Podrían los participantes experimentar alguna molestia u otros efectos secundarios?</w:t>
+      </w:r>
+      <w:r>
+        <w:rPr>
+          <w:sz w:val="22"/>
+          <w:szCs w:val="22"/>
+        </w:rPr>
+        <w:t xml:space="preserve"/>
+      </w:r>
+    </w:p>
+    <w:p>
+      <w:pPr>
+        <w:spacing w:after="120" w:line="300"/>
+        <w:jc w:val="both"/>
+      </w:pPr>
+      <w:r>
+        <w:t xml:space="preserve">Este estudio </w:t>
+      </w:r>
+      <w:r>
+        <w:rPr>
+          <w:b/>
+          <w:bCs/>
+        </w:rPr>
+        <w:t xml:space="preserve">no tiene riesgos físicos</w:t>
+      </w:r>
+      <w:r>
+        <w:t xml:space="preserve">: no se toman muestras, no se hacen pruebas médicas ni se le pide consumir ninguna sustancia. Responder el cuestionario es comparable a llenar una encuesta en redes sociales.</w:t>
+      </w:r>
+    </w:p>
+    <w:p>
+      <w:pPr>
+        <w:spacing w:after="120" w:line="300"/>
+        <w:jc w:val="both"/>
+      </w:pPr>
+      <w:r>
+        <w:t xml:space="preserve">Algunas preguntas tratan sobre hábitos personales (consumo de vapeador o tabaco) y síntomas de salud, y podrían resultarle incómodas. Para proteger su privacidad, el cuestionario es </w:t>
+      </w:r>
+      <w:r>
+        <w:rPr>
+          <w:b/>
+          <w:bCs/>
+        </w:rPr>
+        <w:t xml:space="preserve">anónimo</w:t>
+      </w:r>
+      <w:r>
+        <w:t xml:space="preserve">. Además, puede </w:t>
+      </w:r>
+      <w:r>
+        <w:rPr>
+          <w:b/>
+          <w:bCs/>
+        </w:rPr>
+        <w:t xml:space="preserve">dejar sin responder</w:t>
+      </w:r>
+      <w:r>
+        <w:t xml:space="preserve"> cualquier pregunta o abandonar el cuestionario en cualquier momento.</w:t>
+      </w:r>
+    </w:p>
+    <w:p>
+      <w:pPr>
+        <w:spacing w:after="120" w:line="300"/>
+        <w:jc w:val="both"/>
+      </w:pPr>
+      <w:r>
+        <w:t xml:space="preserve">Este cuestionario </w:t>
+      </w:r>
+      <w:r>
+        <w:rPr>
+          <w:b/>
+          <w:bCs/>
+        </w:rPr>
+        <w:t xml:space="preserve">no es un examen médico ni brinda un diagnóstico</w:t>
+      </w:r>
+      <w:r>
+        <w:t xml:space="preserve">. Si le preocupa algún síntoma respiratorio, le recomendamos acudir a un profesional de la salud.</w:t>
+      </w:r>
+    </w:p>
+    <w:p>
+      <w:pPr>
+        <w:spacing w:after="120" w:line="300"/>
+        <w:jc w:val="both"/>
+      </w:pPr>
+      <w:r>
+        <w:t xml:space="preserve"/>
+      </w:r>
+      <w:r>
+        <w:rPr>
+          <w:b/>
+          <w:bCs/>
+        </w:rPr>
+        <w:t xml:space="preserve">Criterios de inclusión:</w:t>
+      </w:r>
+      <w:r>
+        <w:t xml:space="preserve"> ser estudiante regular de pregrado de la Universidad NUR en el semestre 2-2026, tener 18 años o más y aceptar participar.</w:t>
+      </w:r>
+    </w:p>
+    <w:p>
+      <w:pPr>
+        <w:spacing w:after="120" w:line="300"/>
+        <w:jc w:val="both"/>
+      </w:pPr>
+      <w:r>
+        <w:t xml:space="preserve"/>
+      </w:r>
+      <w:r>
+        <w:rPr>
+          <w:b/>
+          <w:bCs/>
+        </w:rPr>
+        <w:t xml:space="preserve">Criterios de exclusión:</w:t>
+      </w:r>
+      <w:r>
+        <w:t xml:space="preserve"> estudiantes menores de 18 años, de posgrado, de programas a distancia o de intercambio de corta duración.</w:t>
+      </w:r>
+    </w:p>
+    <w:p>
+      <w:pPr>
+        <w:keepNext/>
+        <w:spacing w:after="80" w:before="160"/>
+      </w:pPr>
+      <w:r>
+        <w:rPr>
+          <w:sz w:val="22"/>
+          <w:szCs w:val="22"/>
+        </w:rPr>
+        <w:t xml:space="preserve"/>
+      </w:r>
+      <w:r>
+        <w:rPr>
+          <w:b/>
+          <w:bCs/>
+          <w:sz w:val="22"/>
+          <w:szCs w:val="22"/>
+        </w:rPr>
+        <w:t xml:space="preserve">5. ¿Cómo se utilizarán los datos recopilados en este estudio?</w:t>
+      </w:r>
+      <w:r>
+        <w:rPr>
+          <w:sz w:val="22"/>
+          <w:szCs w:val="22"/>
+        </w:rPr>
+        <w:t xml:space="preserve"/>
+      </w:r>
+    </w:p>
+    <w:p>
+      <w:pPr>
+        <w:spacing w:after="120" w:line="300"/>
+        <w:jc w:val="both"/>
+      </w:pPr>
+      <w:r>
+        <w:t xml:space="preserve">Sus datos serán </w:t>
+      </w:r>
+      <w:r>
+        <w:rPr>
+          <w:b/>
+          <w:bCs/>
+        </w:rPr>
+        <w:t xml:space="preserve">anónimos</w:t>
+      </w:r>
+      <w:r>
+        <w:t xml:space="preserve">. El cuestionario </w:t>
+      </w:r>
+      <w:r>
+        <w:rPr>
+          <w:b/>
+          <w:bCs/>
+        </w:rPr>
+        <w:t xml:space="preserve">no solicita su nombre, carnet de identidad, código de estudiante, correo electrónico ni ningún otro dato</w:t>
+      </w:r>
+      <w:r>
+        <w:t xml:space="preserve"> que permita identificarlo/a. Por lo tanto, es imposible asociar sus respuestas con su persona. Esta hoja de consentimiento se guarda </w:t>
+      </w:r>
+      <w:r>
+        <w:rPr>
+          <w:b/>
+          <w:bCs/>
+        </w:rPr>
+        <w:t xml:space="preserve">por separado</w:t>
+      </w:r>
+      <w:r>
+        <w:t xml:space="preserve"> del cuestionario, por lo que no puede vincularse con sus respuestas.</w:t>
+      </w:r>
+    </w:p>
+    <w:p>
+      <w:pPr>
+        <w:spacing w:after="120" w:line="300"/>
+        <w:jc w:val="both"/>
+      </w:pPr>
+      <w:r>
+        <w:t xml:space="preserve">Las respuestas se analizarán </w:t>
+      </w:r>
+      <w:r>
+        <w:rPr>
+          <w:b/>
+          <w:bCs/>
+        </w:rPr>
+        <w:t xml:space="preserve">solo con fines estadísticos y de forma grupal</w:t>
+      </w:r>
+      <w:r>
+        <w:t xml:space="preserve"> (porcentajes, tablas y gráficos). Usted nunca será identificado/a por su nombre, sin excepción. Tampoco se mencionarán nombres en la presentación o posible publicación de los resultados, ni será posible sacar conclusiones sobre ninguna persona en particular.</w:t>
+      </w:r>
+    </w:p>
+    <w:p>
+      <w:pPr>
+        <w:spacing w:after="120" w:line="300"/>
+        <w:jc w:val="both"/>
+      </w:pPr>
+      <w:r>
+        <w:t xml:space="preserve">Solo los tres investigadores y el docente de la asignatura tendrán acceso a los datos, y están obligados a mantener la confidencialidad. Los datos se guardarán en un archivo protegido con contraseña y serán </w:t>
+      </w:r>
+      <w:r>
+        <w:rPr>
+          <w:b/>
+          <w:bCs/>
+        </w:rPr>
+        <w:t xml:space="preserve">eliminados al concluir la asignatura (diciembre de 2026)</w:t>
+      </w:r>
+      <w:r>
+        <w:t xml:space="preserve">. La responsable de su eliminación es Sofía Montero (contacto en el punto 7).</w:t>
+      </w:r>
+    </w:p>
+    <w:p>
+      <w:pPr>
+        <w:spacing w:after="120" w:line="300"/>
+        <w:jc w:val="both"/>
+      </w:pPr>
+      <w:r>
+        <w:t xml:space="preserve"/>
+      </w:r>
+      <w:r>
+        <w:rPr>
+          <w:b/>
+          <w:bCs/>
+        </w:rPr>
+        <w:t xml:space="preserve">Importante:</w:t>
+      </w:r>
+      <w:r>
+        <w:t xml:space="preserve"> como las respuestas son anónimas, una vez enviado el cuestionario no es posible identificar ni eliminar sus respuestas individuales. Si desea retirarse del estudio, puede hacerlo en cualquier momento </w:t>
+      </w:r>
+      <w:r>
+        <w:rPr>
+          <w:b/>
+          <w:bCs/>
+        </w:rPr>
+        <w:t xml:space="preserve">antes de enviar</w:t>
+      </w:r>
+      <w:r>
+        <w:t xml:space="preserve"> el cuestionario.</w:t>
+      </w:r>
+    </w:p>
+    <w:p>
+      <w:pPr>
+        <w:keepNext/>
+        <w:spacing w:after="80" w:before="160"/>
+      </w:pPr>
+      <w:r>
+        <w:rPr>
+          <w:sz w:val="22"/>
+          <w:szCs w:val="22"/>
+        </w:rPr>
+        <w:t xml:space="preserve"/>
+      </w:r>
+      <w:r>
+        <w:rPr>
+          <w:b/>
+          <w:bCs/>
+          <w:sz w:val="22"/>
+          <w:szCs w:val="22"/>
+        </w:rPr>
+        <w:t xml:space="preserve">6. ¿Habrá algún costo para los participantes? ¿Recibirán un reembolso o una remuneración?</w:t>
+      </w:r>
+      <w:r>
+        <w:rPr>
+          <w:sz w:val="22"/>
+          <w:szCs w:val="22"/>
+        </w:rPr>
+        <w:t xml:space="preserve"/>
+      </w:r>
+    </w:p>
+    <w:p>
+      <w:pPr>
+        <w:spacing w:after="120" w:line="300"/>
+        <w:jc w:val="both"/>
+      </w:pPr>
+      <w:r>
+        <w:t xml:space="preserve">No incurrirá en ningún costo por participar en este estudio. Tampoco recibirá pago ni remuneración por su participación.</w:t>
+      </w:r>
+    </w:p>
+    <w:p>
+      <w:pPr>
+        <w:keepNext/>
+        <w:spacing w:after="80" w:before="160"/>
+      </w:pPr>
+      <w:r>
+        <w:rPr>
+          <w:sz w:val="22"/>
+          <w:szCs w:val="22"/>
+        </w:rPr>
+        <w:t xml:space="preserve"/>
+      </w:r>
+      <w:r>
+        <w:rPr>
+          <w:b/>
+          <w:bCs/>
+          <w:sz w:val="22"/>
+          <w:szCs w:val="22"/>
+        </w:rPr>
+        <w:t xml:space="preserve">7. Posibilidad de aclarar dudas adicionales</w:t>
+      </w:r>
+      <w:r>
+        <w:rPr>
+          <w:sz w:val="22"/>
+          <w:szCs w:val="22"/>
+        </w:rPr>
+        <w:t xml:space="preserve"/>
+      </w:r>
+    </w:p>
+    <w:p>
+      <w:pPr>
+        <w:spacing w:after="120" w:line="300"/>
+        <w:jc w:val="both"/>
+      </w:pPr>
+      <w:r>
+        <w:t xml:space="preserve">Los investigadores estarán encantados de responder cualquier otra pregunta que tenga sobre el estudio, incluidas, por supuesto, todas las preguntas sobre sus derechos como participante.</w:t>
+      </w:r>
+    </w:p>
+    <w:p>
+      <w:pPr>
+        <w:spacing w:after="120" w:line="300"/>
+        <w:jc w:val="both"/>
+      </w:pPr>
+      <w:r>
+        <w:t xml:space="preserve"/>
+      </w:r>
+      <w:r>
+        <w:rPr>
+          <w:b/>
+          <w:bCs/>
+        </w:rPr>
+        <w:t xml:space="preserve">Nombre(s) de la(s) persona(s) de contacto:</w:t>
+      </w:r>
+      <w:r>
         <w:t xml:space="preserve"/>
       </w:r>
     </w:p>
@@ -9159,13 +10294,13 @@
         </w:tblBorders>
       </w:tblPr>
       <w:tblGrid>
-        <w:gridCol w:w="2600"/>
-        <w:gridCol w:w="6760"/>
+        <w:gridCol w:w="3400"/>
+        <w:gridCol w:w="5960"/>
       </w:tblGrid>
       <w:tr>
         <w:tc>
           <w:tcPr>
-            <w:tcW w:type="dxa" w:w="2600"/>
+            <w:tcW w:type="dxa" w:w="3400"/>
             <w:tcBorders>
               <w:top w:val="single" w:color="8EA9C1" w:sz="4"/>
               <w:left w:val="single" w:color="8EA9C1" w:sz="4"/>
@@ -9197,7 +10332,7 @@
                 <w:sz w:val="20"/>
                 <w:szCs w:val="20"/>
               </w:rPr>
-              <w:t xml:space="preserve">Título del estudio</w:t>
+              <w:t xml:space="preserve">Coordinador del estudio (docente de la asignatura)</w:t>
             </w:r>
             <w:r>
               <w:rPr>
@@ -9210,30 +10345,42 @@
         </w:tc>
         <w:tc>
           <w:tcPr>
-            <w:tcW w:type="dxa" w:w="6760"/>
-            <w:tcBorders>
-              <w:top w:val="single" w:color="8EA9C1" w:sz="4"/>
-              <w:left w:val="single" w:color="8EA9C1" w:sz="4"/>
-              <w:bottom w:val="single" w:color="8EA9C1" w:sz="4"/>
-              <w:right w:val="single" w:color="8EA9C1" w:sz="4"/>
-            </w:tcBorders>
-            <w:tcMar>
-              <w:top w:type="dxa" w:w="80"/>
-              <w:left w:type="dxa" w:w="110"/>
-              <w:bottom w:type="dxa" w:w="80"/>
-              <w:right w:type="dxa" w:w="110"/>
-            </w:tcMar>
-          </w:tcPr>
-          <w:p>
-            <w:pPr>
-              <w:spacing w:after="40"/>
-            </w:pPr>
-            <w:r>
-              <w:rPr>
-                <w:sz w:val="20"/>
-                <w:szCs w:val="20"/>
-              </w:rPr>
-              <w:t xml:space="preserve">Prevalencia del uso de cigarrillos electrónicos y su relación con la percepción de riesgo y los síntomas respiratorios en estudiantes de la Universidad NUR, 2026.</w:t>
+            <w:tcW w:type="dxa" w:w="5960"/>
+            <w:tcBorders>
+              <w:top w:val="single" w:color="8EA9C1" w:sz="4"/>
+              <w:left w:val="single" w:color="8EA9C1" w:sz="4"/>
+              <w:bottom w:val="single" w:color="8EA9C1" w:sz="4"/>
+              <w:right w:val="single" w:color="8EA9C1" w:sz="4"/>
+            </w:tcBorders>
+            <w:tcMar>
+              <w:top w:type="dxa" w:w="80"/>
+              <w:left w:type="dxa" w:w="110"/>
+              <w:bottom w:type="dxa" w:w="80"/>
+              <w:right w:type="dxa" w:w="110"/>
+            </w:tcMar>
+          </w:tcPr>
+          <w:p>
+            <w:pPr>
+              <w:spacing w:after="40"/>
+            </w:pPr>
+            <w:r>
+              <w:rPr>
+                <w:sz w:val="20"/>
+                <w:szCs w:val="20"/>
+              </w:rPr>
+              <w:t xml:space="preserve">Nombre: ______________________________</w:t>
+            </w:r>
+          </w:p>
+          <w:p>
+            <w:pPr>
+              <w:spacing w:after="40"/>
+            </w:pPr>
+            <w:r>
+              <w:rPr>
+                <w:sz w:val="20"/>
+                <w:szCs w:val="20"/>
+              </w:rPr>
+              <w:t xml:space="preserve">Correo electrónico: ______________________</w:t>
             </w:r>
           </w:p>
         </w:tc>
@@ -9241,7 +10388,7 @@
       <w:tr>
         <w:tc>
           <w:tcPr>
-            <w:tcW w:type="dxa" w:w="2600"/>
+            <w:tcW w:type="dxa" w:w="3400"/>
             <w:tcBorders>
               <w:top w:val="single" w:color="8EA9C1" w:sz="4"/>
               <w:left w:val="single" w:color="8EA9C1" w:sz="4"/>
@@ -9274,7 +10421,7 @@
                 <w:sz w:val="20"/>
                 <w:szCs w:val="20"/>
               </w:rPr>
-              <w:t xml:space="preserve">Investigadores</w:t>
+              <w:t xml:space="preserve">Investigador principal</w:t>
             </w:r>
             <w:r>
               <w:rPr>
@@ -9287,7 +10434,7 @@
         </w:tc>
         <w:tc>
           <w:tcPr>
-            <w:tcW w:type="dxa" w:w="6760"/>
+            <w:tcW w:type="dxa" w:w="5960"/>
             <w:tcBorders>
               <w:top w:val="single" w:color="8EA9C1" w:sz="4"/>
               <w:left w:val="single" w:color="8EA9C1" w:sz="4"/>
@@ -9311,7 +10458,31 @@
                 <w:sz w:val="20"/>
                 <w:szCs w:val="20"/>
               </w:rPr>
-              <w:t xml:space="preserve">Fabián Bravo, Sofía Montero y Ariane Becerra, estudiantes de la Carrera de Marketing, asignatura Investigación II.</w:t>
+              <w:t xml:space="preserve">Nombre: Fabián Bravo</w:t>
+            </w:r>
+          </w:p>
+          <w:p>
+            <w:pPr>
+              <w:spacing w:after="40"/>
+            </w:pPr>
+            <w:r>
+              <w:rPr>
+                <w:sz w:val="20"/>
+                <w:szCs w:val="20"/>
+              </w:rPr>
+              <w:t xml:space="preserve">Correo electrónico: ______________________</w:t>
+            </w:r>
+          </w:p>
+          <w:p>
+            <w:pPr>
+              <w:spacing w:after="40"/>
+            </w:pPr>
+            <w:r>
+              <w:rPr>
+                <w:sz w:val="20"/>
+                <w:szCs w:val="20"/>
+              </w:rPr>
+              <w:t xml:space="preserve">Teléfono: ______________________</w:t>
             </w:r>
           </w:p>
         </w:tc>
@@ -9319,7 +10490,7 @@
       <w:tr>
         <w:tc>
           <w:tcPr>
-            <w:tcW w:type="dxa" w:w="2600"/>
+            <w:tcW w:type="dxa" w:w="3400"/>
             <w:tcBorders>
               <w:top w:val="single" w:color="8EA9C1" w:sz="4"/>
               <w:left w:val="single" w:color="8EA9C1" w:sz="4"/>
@@ -9351,7 +10522,7 @@
                 <w:sz w:val="20"/>
                 <w:szCs w:val="20"/>
               </w:rPr>
-              <w:t xml:space="preserve">Institución</w:t>
+              <w:t xml:space="preserve">Otras personas relevantes</w:t>
             </w:r>
             <w:r>
               <w:rPr>
@@ -9364,30 +10535,42 @@
         </w:tc>
         <w:tc>
           <w:tcPr>
-            <w:tcW w:type="dxa" w:w="6760"/>
-            <w:tcBorders>
-              <w:top w:val="single" w:color="8EA9C1" w:sz="4"/>
-              <w:left w:val="single" w:color="8EA9C1" w:sz="4"/>
-              <w:bottom w:val="single" w:color="8EA9C1" w:sz="4"/>
-              <w:right w:val="single" w:color="8EA9C1" w:sz="4"/>
-            </w:tcBorders>
-            <w:tcMar>
-              <w:top w:type="dxa" w:w="80"/>
-              <w:left w:type="dxa" w:w="110"/>
-              <w:bottom w:type="dxa" w:w="80"/>
-              <w:right w:type="dxa" w:w="110"/>
-            </w:tcMar>
-          </w:tcPr>
-          <w:p>
-            <w:pPr>
-              <w:spacing w:after="40"/>
-            </w:pPr>
-            <w:r>
-              <w:rPr>
-                <w:sz w:val="20"/>
-                <w:szCs w:val="20"/>
-              </w:rPr>
-              <w:t xml:space="preserve">Universidad NUR, Santa Cruz de la Sierra, Bolivia.</w:t>
+            <w:tcW w:type="dxa" w:w="5960"/>
+            <w:tcBorders>
+              <w:top w:val="single" w:color="8EA9C1" w:sz="4"/>
+              <w:left w:val="single" w:color="8EA9C1" w:sz="4"/>
+              <w:bottom w:val="single" w:color="8EA9C1" w:sz="4"/>
+              <w:right w:val="single" w:color="8EA9C1" w:sz="4"/>
+            </w:tcBorders>
+            <w:tcMar>
+              <w:top w:type="dxa" w:w="80"/>
+              <w:left w:type="dxa" w:w="110"/>
+              <w:bottom w:type="dxa" w:w="80"/>
+              <w:right w:type="dxa" w:w="110"/>
+            </w:tcMar>
+          </w:tcPr>
+          <w:p>
+            <w:pPr>
+              <w:spacing w:after="40"/>
+            </w:pPr>
+            <w:r>
+              <w:rPr>
+                <w:sz w:val="20"/>
+                <w:szCs w:val="20"/>
+              </w:rPr>
+              <w:t xml:space="preserve">Nombre: Sofía Montero – Correo / teléfono: ______________________</w:t>
+            </w:r>
+          </w:p>
+          <w:p>
+            <w:pPr>
+              <w:spacing w:after="40"/>
+            </w:pPr>
+            <w:r>
+              <w:rPr>
+                <w:sz w:val="20"/>
+                <w:szCs w:val="20"/>
+              </w:rPr>
+              <w:t xml:space="preserve">Nombre: Ariane Becerra – Correo / teléfono: ______________________</w:t>
             </w:r>
           </w:p>
         </w:tc>
@@ -9400,22 +10583,140 @@
     </w:p>
     <w:p>
       <w:pPr>
+        <w:keepNext/>
+        <w:spacing w:after="80" w:before="160"/>
+      </w:pPr>
+      <w:r>
+        <w:rPr>
+          <w:sz w:val="22"/>
+          <w:szCs w:val="22"/>
+        </w:rPr>
+        <w:t xml:space="preserve"/>
+      </w:r>
+      <w:r>
+        <w:rPr>
+          <w:b/>
+          <w:bCs/>
+          <w:sz w:val="22"/>
+          <w:szCs w:val="22"/>
+        </w:rPr>
+        <w:t xml:space="preserve">Declaración de consentimiento</w:t>
+      </w:r>
+      <w:r>
+        <w:rPr>
+          <w:sz w:val="22"/>
+          <w:szCs w:val="22"/>
+        </w:rPr>
+        <w:t xml:space="preserve"/>
+      </w:r>
+    </w:p>
+    <w:p>
+      <w:pPr>
         <w:spacing w:after="120" w:line="300"/>
         <w:jc w:val="both"/>
       </w:pPr>
       <w:r>
-        <w:t xml:space="preserve"/>
+        <w:t xml:space="preserve">Declaro que:</w:t>
+      </w:r>
+    </w:p>
+    <w:p>
+      <w:pPr>
+        <w:pStyle w:val="ListParagraph"/>
+        <w:numPr>
+          <w:ilvl w:val="0"/>
+          <w:numId w:val="2"/>
+        </w:numPr>
+        <w:spacing w:after="60" w:line="280"/>
+      </w:pPr>
+      <w:r>
+        <w:t xml:space="preserve">tengo 18 años o más;</w:t>
+      </w:r>
+    </w:p>
+    <w:p>
+      <w:pPr>
+        <w:pStyle w:val="ListParagraph"/>
+        <w:numPr>
+          <w:ilvl w:val="0"/>
+          <w:numId w:val="2"/>
+        </w:numPr>
+        <w:spacing w:after="60" w:line="280"/>
+      </w:pPr>
+      <w:r>
+        <w:t xml:space="preserve">he leído y comprendido la información sobre el propósito, el procedimiento, los beneficios y los riesgos de este estudio;</w:t>
+      </w:r>
+    </w:p>
+    <w:p>
+      <w:pPr>
+        <w:pStyle w:val="ListParagraph"/>
+        <w:numPr>
+          <w:ilvl w:val="0"/>
+          <w:numId w:val="2"/>
+        </w:numPr>
+        <w:spacing w:after="60" w:line="280"/>
+      </w:pPr>
+      <w:r>
+        <w:t xml:space="preserve">he tenido la oportunidad de hacer preguntas y estas fueron respondidas;</w:t>
+      </w:r>
+    </w:p>
+    <w:p>
+      <w:pPr>
+        <w:pStyle w:val="ListParagraph"/>
+        <w:numPr>
+          <w:ilvl w:val="0"/>
+          <w:numId w:val="2"/>
+        </w:numPr>
+        <w:spacing w:after="60" w:line="280"/>
+      </w:pPr>
+      <w:r>
+        <w:t xml:space="preserve">sé que mi participación es voluntaria y que puedo retirarme en cualquier momento, sin dar razones y sin consecuencias negativas;</w:t>
+      </w:r>
+    </w:p>
+    <w:p>
+      <w:pPr>
+        <w:pStyle w:val="ListParagraph"/>
+        <w:numPr>
+          <w:ilvl w:val="0"/>
+          <w:numId w:val="2"/>
+        </w:numPr>
+        <w:spacing w:after="60" w:line="280"/>
+      </w:pPr>
+      <w:r>
+        <w:t xml:space="preserve">acepto participar en el estudio y que mis respuestas anónimas sean utilizadas con fines académicos.</w:t>
+      </w:r>
+    </w:p>
+    <w:p>
+      <w:pPr>
+        <w:spacing w:after="120" w:line="300"/>
+        <w:jc w:val="both"/>
+      </w:pPr>
+      <w:r>
+        <w:t xml:space="preserve">☐ </w:t>
       </w:r>
       <w:r>
         <w:rPr>
           <w:b/>
           <w:bCs/>
         </w:rPr>
-        <w:t xml:space="preserve">1. Propósito del estudio.</w:t>
-      </w:r>
-      <w:r>
-        <w:t xml:space="preserve"> Te invitamos a participar en una investigación académica que busca conocer cuántos estudiantes de la Universidad NUR usan cigarrillos electrónicos, qué opinan sobre sus riesgos y si presentan síntomas respiratorios.</w:t>
-      </w:r>
+        <w:t xml:space="preserve">Sí, acepto participar</w:t>
+      </w:r>
+      <w:r>
+        <w:t xml:space="preserve">          ☐ </w:t>
+      </w:r>
+      <w:r>
+        <w:rPr>
+          <w:b/>
+          <w:bCs/>
+        </w:rPr>
+        <w:t xml:space="preserve">No acepto participar</w:t>
+      </w:r>
+      <w:r>
+        <w:t xml:space="preserve"/>
+      </w:r>
+    </w:p>
+    <w:p>
+      <w:pPr>
+        <w:spacing w:after="300"/>
+      </w:pPr>
     </w:p>
     <w:p>
       <w:pPr>
@@ -9423,18 +10724,13 @@
         <w:jc w:val="both"/>
       </w:pPr>
       <w:r>
-        <w:t xml:space="preserve"/>
-      </w:r>
-      <w:r>
-        <w:rPr>
-          <w:b/>
-          <w:bCs/>
-        </w:rPr>
-        <w:t xml:space="preserve">2. ¿En qué consiste tu participación?</w:t>
-      </w:r>
-      <w:r>
-        <w:t xml:space="preserve"> Responder un cuestionario de 33 preguntas cerradas, en formato digital o impreso, que toma entre 10 y 12 minutos.</w:t>
-      </w:r>
+        <w:t xml:space="preserve">Firma del participante: ______________________          Fecha: ____ / ____ / 2026</w:t>
+      </w:r>
+    </w:p>
+    <w:p>
+      <w:pPr>
+        <w:spacing w:after="200"/>
+      </w:pPr>
     </w:p>
     <w:p>
       <w:pPr>
@@ -9442,203 +10738,7 @@
         <w:jc w:val="both"/>
       </w:pPr>
       <w:r>
-        <w:t xml:space="preserve"/>
-      </w:r>
-      <w:r>
-        <w:rPr>
-          <w:b/>
-          <w:bCs/>
-        </w:rPr>
-        <w:t xml:space="preserve">3. Riesgos.</w:t>
-      </w:r>
-      <w:r>
-        <w:t xml:space="preserve"> No existen riesgos físicos. Algunas preguntas tratan sobre hábitos personales; si alguna te incomoda, puedes no responderla.</w:t>
-      </w:r>
-    </w:p>
-    <w:p>
-      <w:pPr>
-        <w:spacing w:after="120" w:line="300"/>
-        <w:jc w:val="both"/>
-      </w:pPr>
-      <w:r>
-        <w:t xml:space="preserve"/>
-      </w:r>
-      <w:r>
-        <w:rPr>
-          <w:b/>
-          <w:bCs/>
-        </w:rPr>
-        <w:t xml:space="preserve">4. Beneficios.</w:t>
-      </w:r>
-      <w:r>
-        <w:t xml:space="preserve"> No recibirás un beneficio directo ni pago. Los resultados ayudarán a conocer la realidad del consumo en la universidad y podrán servir para diseñar campañas de prevención.</w:t>
-      </w:r>
-    </w:p>
-    <w:p>
-      <w:pPr>
-        <w:spacing w:after="120" w:line="300"/>
-        <w:jc w:val="both"/>
-      </w:pPr>
-      <w:r>
-        <w:t xml:space="preserve"/>
-      </w:r>
-      <w:r>
-        <w:rPr>
-          <w:b/>
-          <w:bCs/>
-        </w:rPr>
-        <w:t xml:space="preserve">5. Participación voluntaria.</w:t>
-      </w:r>
-      <w:r>
-        <w:t xml:space="preserve"> Tu participación es </w:t>
-      </w:r>
-      <w:r>
-        <w:rPr>
-          <w:b/>
-          <w:bCs/>
-        </w:rPr>
-        <w:t xml:space="preserve">totalmente voluntaria</w:t>
-      </w:r>
-      <w:r>
-        <w:t xml:space="preserve">. Puedes negarte o retirarte en cualquier momento, sin dar explicaciones y sin ninguna consecuencia académica.</w:t>
-      </w:r>
-    </w:p>
-    <w:p>
-      <w:pPr>
-        <w:spacing w:after="120" w:line="300"/>
-        <w:jc w:val="both"/>
-      </w:pPr>
-      <w:r>
-        <w:t xml:space="preserve"/>
-      </w:r>
-      <w:r>
-        <w:rPr>
-          <w:b/>
-          <w:bCs/>
-        </w:rPr>
-        <w:t xml:space="preserve">6. Confidencialidad y anonimato.</w:t>
-      </w:r>
-      <w:r>
-        <w:t xml:space="preserve"> El cuestionario </w:t>
-      </w:r>
-      <w:r>
-        <w:rPr>
-          <w:b/>
-          <w:bCs/>
-        </w:rPr>
-        <w:t xml:space="preserve">no pide tu nombre</w:t>
-      </w:r>
-      <w:r>
-        <w:t xml:space="preserve"> ni datos que te identifiquen. Las respuestas se analizarán de forma grupal, solo con fines académicos, y se guardarán protegidas con contraseña. Serán eliminadas al concluir la asignatura.</w:t>
-      </w:r>
-    </w:p>
-    <w:p>
-      <w:pPr>
-        <w:spacing w:after="120" w:line="300"/>
-        <w:jc w:val="both"/>
-      </w:pPr>
-      <w:r>
-        <w:t xml:space="preserve"/>
-      </w:r>
-      <w:r>
-        <w:rPr>
-          <w:b/>
-          <w:bCs/>
-        </w:rPr>
-        <w:t xml:space="preserve">7. Contacto.</w:t>
-      </w:r>
-      <w:r>
-        <w:t xml:space="preserve"> Si tienes dudas, puedes comunicarte con los investigadores: ____________________ (correo o teléfono).</w:t>
-      </w:r>
-    </w:p>
-    <w:p>
-      <w:pPr>
-        <w:spacing w:after="120" w:line="300"/>
-        <w:jc w:val="both"/>
-      </w:pPr>
-      <w:r>
-        <w:t xml:space="preserve"/>
-      </w:r>
-      <w:r>
-        <w:rPr>
-          <w:b/>
-          <w:bCs/>
-        </w:rPr>
-        <w:t xml:space="preserve">Declaración de consentimiento</w:t>
-      </w:r>
-      <w:r>
-        <w:t xml:space="preserve"/>
-      </w:r>
-    </w:p>
-    <w:p>
-      <w:pPr>
-        <w:spacing w:after="120" w:line="300"/>
-        <w:jc w:val="both"/>
-      </w:pPr>
-      <w:r>
-        <w:t xml:space="preserve">Declaro que tengo 18 años o más, que he leído (o me han leído) la información anterior, que pude hacer preguntas y que </w:t>
-      </w:r>
-      <w:r>
-        <w:rPr>
-          <w:b/>
-          <w:bCs/>
-        </w:rPr>
-        <w:t xml:space="preserve">acepto participar voluntariamente</w:t>
-      </w:r>
-      <w:r>
-        <w:t xml:space="preserve"> en este estudio.</w:t>
-      </w:r>
-    </w:p>
-    <w:p>
-      <w:pPr>
-        <w:spacing w:after="120" w:line="300"/>
-        <w:jc w:val="both"/>
-      </w:pPr>
-      <w:r>
-        <w:t xml:space="preserve">☐ </w:t>
-      </w:r>
-      <w:r>
-        <w:rPr>
-          <w:b/>
-          <w:bCs/>
-        </w:rPr>
-        <w:t xml:space="preserve">Sí, acepto participar</w:t>
-      </w:r>
-      <w:r>
-        <w:t xml:space="preserve">          ☐ </w:t>
-      </w:r>
-      <w:r>
-        <w:rPr>
-          <w:b/>
-          <w:bCs/>
-        </w:rPr>
-        <w:t xml:space="preserve">No acepto participar</w:t>
-      </w:r>
-      <w:r>
-        <w:t xml:space="preserve"/>
-      </w:r>
-    </w:p>
-    <w:p>
-      <w:pPr>
-        <w:spacing w:after="240"/>
-      </w:pPr>
-    </w:p>
-    <w:p>
-      <w:pPr>
-        <w:spacing w:after="120" w:line="300"/>
-        <w:jc w:val="both"/>
-      </w:pPr>
-      <w:r>
-        <w:t xml:space="preserve">Firma del participante: ______________________          Fecha: ____ / ____ / 2026</w:t>
-      </w:r>
-    </w:p>
-    <w:p>
-      <w:pPr>
-        <w:spacing w:after="120" w:line="300"/>
-        <w:jc w:val="both"/>
-      </w:pPr>
-      <w:r>
-        <w:t xml:space="preserve">Firma del investigador: ______________________</w:t>
+        <w:t xml:space="preserve">Firma del investigador: ______________________          Nombre: ______________________</w:t>
       </w:r>
     </w:p>
     <w:p>
@@ -9673,7 +10773,7 @@
           <w:sz w:val="20"/>
           <w:szCs w:val="20"/>
         </w:rPr>
-        <w:t xml:space="preserve">, este texto va en la primera página, y la pregunta «¿Aceptas participar?» es obligatoria. Si el estudiante marca «No», el formulario termina.</w:t>
+        <w:t xml:space="preserve">, este texto va en la primera sección. La pregunta «¿Acepta participar?» es obligatoria y no se pide firma ni nombre, para mantener el anonimato. Si el estudiante marca «No acepto», el formulario termina.</w:t>
       </w:r>
     </w:p>
     <w:p>
@@ -12333,7 +13433,7 @@
                 <w:sz w:val="20"/>
                 <w:szCs w:val="20"/>
               </w:rPr>
-              <w:t xml:space="preserve">Cuestionario anónimo de 33 preguntas en 5 secciones. Consentimiento voluntario y confidencial, solo para mayores de 18 años.</w:t>
+              <w:t xml:space="preserve">Cuestionario anónimo de 33 preguntas en 5 secciones. Consentimiento según el formato del docente: voluntario, anónimo, solo para mayores de 18 años.</w:t>
             </w:r>
           </w:p>
         </w:tc>
@@ -12921,6 +14021,67 @@
                 <w:sz w:val="20"/>
                 <w:szCs w:val="20"/>
               </w:rPr>
+              <w:t xml:space="preserve">¿Por qué su consentimiento no tiene todos los puntos del formato?</w:t>
+            </w:r>
+          </w:p>
+        </w:tc>
+        <w:tc>
+          <w:tcPr>
+            <w:tcW w:type="dxa" w:w="5960"/>
+            <w:tcBorders>
+              <w:top w:val="single" w:color="8EA9C1" w:sz="4"/>
+              <w:left w:val="single" w:color="8EA9C1" w:sz="4"/>
+              <w:bottom w:val="single" w:color="8EA9C1" w:sz="4"/>
+              <w:right w:val="single" w:color="8EA9C1" w:sz="4"/>
+            </w:tcBorders>
+            <w:tcMar>
+              <w:top w:type="dxa" w:w="80"/>
+              <w:left w:type="dxa" w:w="110"/>
+              <w:bottom w:type="dxa" w:w="80"/>
+              <w:right w:type="dxa" w:w="110"/>
+            </w:tcMar>
+          </w:tcPr>
+          <w:p>
+            <w:pPr>
+              <w:spacing w:after="40"/>
+            </w:pPr>
+            <w:r>
+              <w:rPr>
+                <w:sz w:val="20"/>
+                <w:szCs w:val="20"/>
+              </w:rPr>
+              <w:t xml:space="preserve">Seguimos las instrucciones del formato: quitamos los puntos en verde (solo para estudios experimentales en salud) y el punto 7 (solo para estudios longitudinales), porque el nuestro es una encuesta transversal.</w:t>
+            </w:r>
+          </w:p>
+        </w:tc>
+      </w:tr>
+      <w:tr>
+        <w:tc>
+          <w:tcPr>
+            <w:tcW w:type="dxa" w:w="3400"/>
+            <w:tcBorders>
+              <w:top w:val="single" w:color="8EA9C1" w:sz="4"/>
+              <w:left w:val="single" w:color="8EA9C1" w:sz="4"/>
+              <w:bottom w:val="single" w:color="8EA9C1" w:sz="4"/>
+              <w:right w:val="single" w:color="8EA9C1" w:sz="4"/>
+            </w:tcBorders>
+            <w:shd w:fill="F2F2F2" w:color="auto" w:val="clear"/>
+            <w:tcMar>
+              <w:top w:type="dxa" w:w="80"/>
+              <w:left w:type="dxa" w:w="110"/>
+              <w:bottom w:type="dxa" w:w="80"/>
+              <w:right w:type="dxa" w:w="110"/>
+            </w:tcMar>
+          </w:tcPr>
+          <w:p>
+            <w:pPr>
+              <w:spacing w:after="40"/>
+            </w:pPr>
+            <w:r>
+              <w:rPr>
+                <w:sz w:val="20"/>
+                <w:szCs w:val="20"/>
+              </w:rPr>
               <w:t xml:space="preserve">¿Qué muestreo usarían en la IAP?</w:t>
             </w:r>
           </w:p>
@@ -12934,6 +14095,7 @@
               <w:bottom w:val="single" w:color="8EA9C1" w:sz="4"/>
               <w:right w:val="single" w:color="8EA9C1" w:sz="4"/>
             </w:tcBorders>
+            <w:shd w:fill="F2F2F2" w:color="auto" w:val="clear"/>
             <w:tcMar>
               <w:top w:type="dxa" w:w="80"/>
               <w:left w:type="dxa" w:w="110"/>

</xml_diff>